<commit_message>
docs: v4.1.0 multi-provider, MCP compatibility matrix and standalone exe guides
Rewrites model-service setup around the 214-provider catalog with no default vendor, documents stdio/Streamable-HTTP/legacy-SSE and client configs, adds the MCP compatibility dossier, updates the exe/installation guide, screenshots, PDFs and DOCX.
</commit_message>
<xml_diff>
--- a/APP_Release_Release_Version/Reference/My_APP_Introduction.docx
+++ b/APP_Release_Release_Version/Reference/My_APP_Introduction.docx
@@ -342,7 +342,7 @@
                 <w:color w:val="1F2937"/>
                 <w:sz w:val="18"/>
               </w:rPr>
-              <w:t>v4.0.0</w:t>
+              <w:t>v4.1.0</w:t>
             </w:r>
           </w:p>
         </w:tc>
@@ -397,7 +397,7 @@
           <w:color w:val="1F2937"/>
           <w:sz w:val="21"/>
         </w:rPr>
-        <w:t>团队此前已用 MATLAB App Designer 开发了 V3.0 匹配软件（Impedance_Matching.exe），包含五种拓扑、Smith 圆图动画和耐压分析。但它仍然是一个“点按钮”的工具，不能与 AI 智能体协作。因此我们在 V3.0 基础上做了 V4.0：保留原 MATLAB 内核，增加 Python/MATLAB 双计算引擎、MCP 标准接口、DeepSeek 智能体与现代化可视化界面，让软件既能“自己算”，也能“被 AI 调用”。</w:t>
+        <w:t>团队此前已用 MATLAB App Designer 开发了 V3.0 匹配软件（Impedance_Matching.exe），包含五种拓扑、Smith 圆图动画和耐压分析。但它仍然是一个“点按钮”的工具，不能与 AI 智能体协作。因此我们在 V3.0 基础上做了 V4.0：保留原 MATLAB 内核，增加 Python/MATLAB 双计算引擎、MCP 标准接口、多模型工具调用智能体与现代化可视化界面，让软件既能“自己算”，也能“被 AI 调用”。</w:t>
       </w:r>
     </w:p>
     <w:p>
@@ -500,7 +500,7 @@
           <w:color w:val="1F2937"/>
           <w:sz w:val="21"/>
         </w:rPr>
-        <w:t>DeepSeek 调用本地工具，用微波工程语言解释结果；</w:t>
+        <w:t>大模型调用本地工具，用微波工程语言解释结果；</w:t>
       </w:r>
     </w:p>
     <w:p>
@@ -524,7 +524,7 @@
           <w:color w:val="1F2937"/>
           <w:sz w:val="21"/>
         </w:rPr>
-        <w:t>15 个 MCP 工具，ZCode / Claude / Cursor 等客户端可直接使用；</w:t>
+        <w:t>15 个 MCP 工具，支持 stdio / HTTP / SSE，ZCode / Claude Code / Codex / Cursor 等客户端可直接使用；</w:t>
       </w:r>
     </w:p>
     <w:p>
@@ -644,7 +644,7 @@
           <w:color w:val="1F2937"/>
           <w:sz w:val="20"/>
         </w:rPr>
-        <w:t>把匹配计算、扫描、复核、耐压、报告封装成 15 个 MCP 工具，任何智能体都能调用。这不是让大模型背公式，而是让大模型调用真实计算引擎，从根源上减少幻觉。</w:t>
+        <w:t>把匹配计算、扫描、复核、耐压、报告封装成 15 个 MCP 工具，任何支持 MCP 的智能体都能调用。这不是让大模型背公式，而是让大模型调用真实计算引擎，从根源上减少幻觉。</w:t>
       </w:r>
     </w:p>
     <w:p>
@@ -860,7 +860,7 @@
                 <w:color w:val="1F2937"/>
                 <w:sz w:val="18"/>
               </w:rPr>
-              <w:t>DeepSeek 对话、工具调用、SSE 流式、附件解析、设计卡片、上下文</w:t>
+              <w:t>多模型对话、工具调用、SSE 流式、附件解析、设计卡片、上下文</w:t>
             </w:r>
           </w:p>
         </w:tc>
@@ -1112,7 +1112,7 @@
                 <w:color w:val="1F2937"/>
                 <w:sz w:val="18"/>
               </w:rPr>
-              <w:t>15 工具、3 资源、3 提示模板、stdio/HTTP</w:t>
+              <w:t>15 工具、3 资源、3 提示模板、stdio/HTTP/SSE</w:t>
             </w:r>
           </w:p>
         </w:tc>
@@ -1148,7 +1148,7 @@
                 <w:color w:val="1F2937"/>
                 <w:sz w:val="18"/>
               </w:rPr>
-              <w:t>交大/DeepSeek 预设、模型、Key、引擎、MCP 配置复制</w:t>
+              <w:t>214 家服务商目录、自定义模型 ID、Key、引擎、MCP 配置复制</w:t>
             </w:r>
           </w:p>
         </w:tc>
@@ -1502,7 +1502,7 @@
           <w:color w:val="1F2937"/>
           <w:sz w:val="21"/>
         </w:rPr>
-        <w:t>MCP：JSON-RPC 2.0 over stdio；initialize / tools/list / tools/call / resources / prompts；15 个工具、3 个资源、3 个提示；本地 HTTP 模式；日志写 stderr，stdout 只输出协议 JSON。</w:t>
+        <w:t>MCP：JSON-RPC 2.0；stdio / Streamable HTTP / legacy SSE；initialize / tools/list / tools/call / resources / prompts；15 个工具、3 个资源、3 个提示；本地 HTTP 模式；日志写 stderr，stdout 只输出协议 JSON。</w:t>
       </w:r>
     </w:p>
     <w:p>
@@ -1517,7 +1517,7 @@
           <w:color w:val="1F2937"/>
           <w:sz w:val="21"/>
         </w:rPr>
-        <w:t>智能体：OpenAI 兼容 DeepSeek 接口；工具循环最多 5 轮；系统提示要求“先算后说”；附件解析（PDF/DOCX/XLSX/PPTX/Notebook）；SSE 流式事件。</w:t>
+        <w:t>智能体：OpenAI 兼容 + Anthropic 原生 + Azure 适配；工具循环最多 5 轮；系统提示要求“先算后说”；附件解析（PDF/DOCX/XLSX/PPTX/Notebook）；SSE 流式事件。</w:t>
       </w:r>
     </w:p>
     <w:p>
@@ -1934,7 +1934,7 @@
                 <w:color w:val="1F2937"/>
                 <w:sz w:val="18"/>
               </w:rPr>
-              <w:t>项目负责人；总体架构、Python 计算内核、MCP 协议、DeepSeek 智能体、集成与发布</w:t>
+              <w:t>项目负责人；总体架构、Python 计算内核、MCP 协议、多模型智能体、集成与发布</w:t>
             </w:r>
           </w:p>
         </w:tc>

</xml_diff>

<commit_message>
release: v4.2.0 Windows installer, built-in help, physics audit
</commit_message>
<xml_diff>
--- a/APP_Release_Release_Version/Reference/My_APP_Introduction.docx
+++ b/APP_Release_Release_Version/Reference/My_APP_Introduction.docx
@@ -342,7 +342,7 @@
                 <w:color w:val="1F2937"/>
                 <w:sz w:val="18"/>
               </w:rPr>
-              <w:t>v4.1.0</w:t>
+              <w:t>v4.2.0</w:t>
             </w:r>
           </w:p>
         </w:tc>
@@ -1759,6 +1759,42 @@
                 <w:color w:val="1F2937"/>
                 <w:sz w:val="18"/>
               </w:rPr>
+              <w:t>物理 + Web 帮助审计</w:t>
+            </w:r>
+          </w:p>
+        </w:tc>
+        <w:tc>
+          <w:tcPr>
+            <w:tcW w:type="dxa" w:w="5102"/>
+          </w:tcPr>
+          <w:p>
+            <w:r/>
+            <w:r>
+              <w:rPr>
+                <w:rFonts w:ascii="微软雅黑" w:hAnsi="微软雅黑" w:eastAsia="微软雅黑"/>
+                <w:b w:val="0"/>
+                <w:color w:val="1F2937"/>
+                <w:sz w:val="18"/>
+              </w:rPr>
+              <w:t>7/7 通过（总 26/26）</w:t>
+            </w:r>
+          </w:p>
+        </w:tc>
+      </w:tr>
+      <w:tr>
+        <w:tc>
+          <w:tcPr>
+            <w:tcW w:type="dxa" w:w="3969"/>
+          </w:tcPr>
+          <w:p>
+            <w:r/>
+            <w:r>
+              <w:rPr>
+                <w:rFonts w:ascii="微软雅黑" w:hAnsi="微软雅黑" w:eastAsia="微软雅黑"/>
+                <w:b w:val="0"/>
+                <w:color w:val="1F2937"/>
+                <w:sz w:val="18"/>
+              </w:rPr>
               <w:t>浏览器视觉</w:t>
             </w:r>
           </w:p>

</xml_diff>

<commit_message>
feat: v4.3.0 native WebView2 window and complete uninstaller
</commit_message>
<xml_diff>
--- a/APP_Release_Release_Version/Reference/My_APP_Introduction.docx
+++ b/APP_Release_Release_Version/Reference/My_APP_Introduction.docx
@@ -1759,7 +1759,7 @@
                 <w:color w:val="1F2937"/>
                 <w:sz w:val="18"/>
               </w:rPr>
-              <w:t>物理 + Web 帮助审计</w:t>
+              <w:t>物理 + Web + 卸载审计</w:t>
             </w:r>
           </w:p>
         </w:tc>
@@ -1776,7 +1776,7 @@
                 <w:color w:val="1F2937"/>
                 <w:sz w:val="18"/>
               </w:rPr>
-              <w:t>7/7 通过（总 26/26）</w:t>
+              <w:t>10/10 通过（总 29/29）</w:t>
             </w:r>
           </w:p>
         </w:tc>
@@ -2150,7 +2150,7 @@
         </w:rPr>
         <w:t>仓库：https://github.com/RuilinLu/Impedance_Matching_Calculation</w:t>
         <w:br/>
-        <w:t>版本 v4.0.0 ｜ 2026-10-26 ｜ 团队：卢瑞林、卢柯吉、林芷伊、张昀蕾</w:t>
+        <w:t>版本 v4.3.0 ｜ 2026-10-26 ｜ 团队：卢瑞林、卢柯吉、林芷伊、张昀蕾</w:t>
         <w:br/>
         <w:t>上海交通大学集成电路学院（信息与电子工程学院）</w:t>
       </w:r>

</xml_diff>